<commit_message>
SEHHACA-226: cv: updated date
</commit_message>
<xml_diff>
--- a/assets/doc/abrar_mudhir_cv.docx
+++ b/assets/doc/abrar_mudhir_cv.docx
@@ -162,7 +162,7 @@
           <w:sz w:val="20"/>
           <w:lang w:val="en-GB" w:eastAsia="en-GB"/>
         </w:rPr>
-        <w:pict w14:anchorId="565536BD">
+        <w:pict w14:anchorId="23B58C42">
           <v:group id="_x0000_s2107" style="position:absolute;margin-left:7.05pt;margin-top:12.05pt;width:138.75pt;height:16.5pt;z-index:-5" coordorigin="1342,3892" coordsize="2700,180" o:allowincell="f">
             <v:rect id="_x0000_s2108" style="position:absolute;left:1342;top:3892;width:2700;height:180" fillcolor="#31849b" stroked="f">
               <v:fill opacity="59638f"/>
@@ -441,7 +441,7 @@
           <w:szCs w:val="16"/>
           <w:lang w:val="en-GB"/>
         </w:rPr>
-        <w:t>10</w:t>
+        <w:t>13</w:t>
       </w:r>
       <w:r>
         <w:rPr>
@@ -613,7 +613,7 @@
           <w:sz w:val="20"/>
           <w:lang w:val="en-GB"/>
         </w:rPr>
-        <w:pict w14:anchorId="1E21E507">
+        <w:pict w14:anchorId="06D28C8F">
           <v:group id="_x0000_s2269" style="position:absolute;margin-left:6.8pt;margin-top:131.3pt;width:142.2pt;height:16.5pt;z-index:-1" coordorigin="1342,3892" coordsize="2700,180" o:allowincell="f">
             <v:rect id="_x0000_s2270" style="position:absolute;left:1342;top:3892;width:2700;height:180" fillcolor="#31849b" stroked="f">
               <v:fill opacity="59638f"/>
@@ -632,7 +632,7 @@
           <w:sz w:val="20"/>
           <w:lang w:val="en-GB"/>
         </w:rPr>
-        <w:pict w14:anchorId="155BF465">
+        <w:pict w14:anchorId="5666EF7D">
           <v:group id="_x0000_s2212" style="position:absolute;margin-left:6.8pt;margin-top:12.45pt;width:142.2pt;height:16.5pt;z-index:-4" coordorigin="1342,3892" coordsize="2700,180" o:allowincell="f">
             <v:rect id="_x0000_s2213" style="position:absolute;left:1342;top:3892;width:2700;height:180" fillcolor="#31849b" stroked="f">
               <v:fill opacity="59638f"/>
@@ -1394,17 +1394,54 @@
               </w:rPr>
               <w:t xml:space="preserve"> (</w:t>
             </w:r>
-            <w:hyperlink r:id="rId12" w:history="1">
-              <w:r>
-                <w:rPr>
-                  <w:rStyle w:val="Hyperlink"/>
-                  <w:rFonts w:ascii="Verdana" w:hAnsi="Verdana" w:cs="Verdana"/>
-                  <w:sz w:val="20"/>
-                  <w:lang w:val="it-IT" w:eastAsia="ar-SA"/>
-                </w:rPr>
-                <w:t>AI-102</w:t>
-              </w:r>
-            </w:hyperlink>
+            <w:r>
+              <w:rPr>
+                <w:rFonts w:ascii="Verdana" w:hAnsi="Verdana" w:cs="Verdana"/>
+                <w:sz w:val="20"/>
+                <w:lang w:val="en-GB" w:eastAsia="ar-SA"/>
+              </w:rPr>
+              <w:fldChar w:fldCharType="begin"/>
+            </w:r>
+            <w:r>
+              <w:rPr>
+                <w:rFonts w:ascii="Verdana" w:hAnsi="Verdana" w:cs="Verdana"/>
+                <w:sz w:val="20"/>
+                <w:lang w:val="it-IT" w:eastAsia="ar-SA"/>
+              </w:rPr>
+              <w:instrText>HYPERLINK "https://learn.microsoft.com/api/credentials/share/en-gb/AbrarMudhir-6026/D34862B3E92762BE?sharingId=6CDE1921338520C9"</w:instrText>
+            </w:r>
+            <w:r>
+              <w:rPr>
+                <w:rFonts w:ascii="Verdana" w:hAnsi="Verdana" w:cs="Verdana"/>
+                <w:sz w:val="20"/>
+                <w:lang w:val="en-GB" w:eastAsia="ar-SA"/>
+              </w:rPr>
+            </w:r>
+            <w:r>
+              <w:rPr>
+                <w:rFonts w:ascii="Verdana" w:hAnsi="Verdana" w:cs="Verdana"/>
+                <w:sz w:val="20"/>
+                <w:lang w:val="en-GB" w:eastAsia="ar-SA"/>
+              </w:rPr>
+              <w:fldChar w:fldCharType="separate"/>
+            </w:r>
+            <w:r>
+              <w:rPr>
+                <w:rStyle w:val="Hyperlink"/>
+                <w:rFonts w:ascii="Verdana" w:hAnsi="Verdana" w:cs="Verdana"/>
+                <w:sz w:val="20"/>
+                <w:lang w:val="it-IT" w:eastAsia="ar-SA"/>
+              </w:rPr>
+              <w:t>AI-102</w:t>
+            </w:r>
+            <w:r>
+              <w:rPr>
+                <w:rFonts w:ascii="Verdana" w:hAnsi="Verdana" w:cs="Verdana"/>
+                <w:sz w:val="20"/>
+                <w:lang w:val="en-GB" w:eastAsia="ar-SA"/>
+              </w:rPr>
+              <w:fldChar w:fldCharType="end"/>
+            </w:r>
             <w:r>
               <w:rPr>
                 <w:rFonts w:ascii="Verdana" w:hAnsi="Verdana" w:cs="Verdana"/>
@@ -1553,7 +1590,7 @@
               </w:rPr>
               <w:t xml:space="preserve"> (</w:t>
             </w:r>
-            <w:hyperlink r:id="rId13" w:history="1">
+            <w:hyperlink r:id="rId12" w:history="1">
               <w:r>
                 <w:rPr>
                   <w:rStyle w:val="Hyperlink"/>
@@ -1625,7 +1662,7 @@
               </w:rPr>
               <w:t xml:space="preserve"> (</w:t>
             </w:r>
-            <w:hyperlink r:id="rId14" w:history="1">
+            <w:hyperlink r:id="rId13" w:history="1">
               <w:r>
                 <w:rPr>
                   <w:rStyle w:val="Hyperlink"/>
@@ -1701,7 +1738,7 @@
               </w:rPr>
               <w:t xml:space="preserve"> (</w:t>
             </w:r>
-            <w:hyperlink r:id="rId15" w:history="1">
+            <w:hyperlink r:id="rId14" w:history="1">
               <w:r>
                 <w:rPr>
                   <w:rStyle w:val="Hyperlink"/>
@@ -1787,7 +1824,7 @@
                 <w:sz w:val="20"/>
                 <w:lang w:val="en-GB" w:eastAsia="ar-SA"/>
               </w:rPr>
-              <w:pict w14:anchorId="03BB78AC">
+              <w:pict w14:anchorId="45FE6853">
                 <v:group id="_x0000_s2263" style="position:absolute;margin-left:7.5pt;margin-top:11.85pt;width:142.2pt;height:16.5pt;z-index:-2;mso-position-horizontal-relative:text;mso-position-vertical-relative:text" coordorigin="1342,3892" coordsize="2700,180" o:allowincell="f">
                   <v:rect id="_x0000_s2264" style="position:absolute;left:1342;top:3892;width:2700;height:180" fillcolor="#31849b" stroked="f">
                     <v:fill opacity="59638f"/>
@@ -1941,7 +1978,7 @@
                 <w:lang w:val="en-GB"/>
               </w:rPr>
             </w:pPr>
-            <w:hyperlink r:id="rId16" w:history="1">
+            <w:hyperlink r:id="rId15" w:history="1">
               <w:r>
                 <w:rPr>
                   <w:rStyle w:val="Hyperlink"/>
@@ -2807,7 +2844,7 @@
                 <w:lang w:val="en-GB"/>
               </w:rPr>
             </w:pPr>
-            <w:hyperlink r:id="rId17" w:history="1">
+            <w:hyperlink r:id="rId16" w:history="1">
               <w:r>
                 <w:rPr>
                   <w:rStyle w:val="Hyperlink"/>
@@ -3550,7 +3587,7 @@
                 <w:lang w:val="en-GB"/>
               </w:rPr>
             </w:pPr>
-            <w:hyperlink r:id="rId18" w:history="1">
+            <w:hyperlink r:id="rId17" w:history="1">
               <w:r>
                 <w:rPr>
                   <w:rStyle w:val="Hyperlink"/>
@@ -3720,7 +3757,133 @@
                 <w:sz w:val="20"/>
                 <w:lang w:val="en-GB" w:eastAsia="ar-SA"/>
               </w:rPr>
-              <w:t>Led the architecture and development of a production Python fund analytics platform, replacing approximately 20 spreadsheet-based models with a scalable, governed application. Designed reusable FastAPI REST APIs, backend services and data models using Python, SQLAlchemy and SQL Server, with Dash/Plotly interfaces. Developed strongly typed FastAPI services using Pydantic validation and SQLAlchemy, with Pytest automated testing. Worked directly with investment stakeholders to translate complex business rules into maintainable software, validate calculation outputs and improve the reliability, consistency and scalability of fund analytics.</w:t>
+              <w:t xml:space="preserve">Led the architecture and development of a production Python fund analytics platform, replacing approximately 20 spreadsheet-based models with a scalable, governed application. Designed reusable </w:t>
+            </w:r>
+            <w:proofErr w:type="spellStart"/>
+            <w:r>
+              <w:rPr>
+                <w:rFonts w:ascii="Verdana" w:hAnsi="Verdana" w:cs="Verdana"/>
+                <w:sz w:val="20"/>
+                <w:lang w:val="en-GB" w:eastAsia="ar-SA"/>
+              </w:rPr>
+              <w:t>FastAPI</w:t>
+            </w:r>
+            <w:proofErr w:type="spellEnd"/>
+            <w:r>
+              <w:rPr>
+                <w:rFonts w:ascii="Verdana" w:hAnsi="Verdana" w:cs="Verdana"/>
+                <w:sz w:val="20"/>
+                <w:lang w:val="en-GB" w:eastAsia="ar-SA"/>
+              </w:rPr>
+              <w:t xml:space="preserve"> REST APIs, backend services and data models using Python, </w:t>
+            </w:r>
+            <w:proofErr w:type="spellStart"/>
+            <w:r>
+              <w:rPr>
+                <w:rFonts w:ascii="Verdana" w:hAnsi="Verdana" w:cs="Verdana"/>
+                <w:sz w:val="20"/>
+                <w:lang w:val="en-GB" w:eastAsia="ar-SA"/>
+              </w:rPr>
+              <w:t>SQLAlchemy</w:t>
+            </w:r>
+            <w:proofErr w:type="spellEnd"/>
+            <w:r>
+              <w:rPr>
+                <w:rFonts w:ascii="Verdana" w:hAnsi="Verdana" w:cs="Verdana"/>
+                <w:sz w:val="20"/>
+                <w:lang w:val="en-GB" w:eastAsia="ar-SA"/>
+              </w:rPr>
+              <w:t xml:space="preserve"> and SQL Server, with Dash/</w:t>
+            </w:r>
+            <w:proofErr w:type="spellStart"/>
+            <w:r>
+              <w:rPr>
+                <w:rFonts w:ascii="Verdana" w:hAnsi="Verdana" w:cs="Verdana"/>
+                <w:sz w:val="20"/>
+                <w:lang w:val="en-GB" w:eastAsia="ar-SA"/>
+              </w:rPr>
+              <w:t>Plotly</w:t>
+            </w:r>
+            <w:proofErr w:type="spellEnd"/>
+            <w:r>
+              <w:rPr>
+                <w:rFonts w:ascii="Verdana" w:hAnsi="Verdana" w:cs="Verdana"/>
+                <w:sz w:val="20"/>
+                <w:lang w:val="en-GB" w:eastAsia="ar-SA"/>
+              </w:rPr>
+              <w:t xml:space="preserve"> interfaces. Developed strongly typed </w:t>
+            </w:r>
+            <w:proofErr w:type="spellStart"/>
+            <w:r>
+              <w:rPr>
+                <w:rFonts w:ascii="Verdana" w:hAnsi="Verdana" w:cs="Verdana"/>
+                <w:sz w:val="20"/>
+                <w:lang w:val="en-GB" w:eastAsia="ar-SA"/>
+              </w:rPr>
+              <w:t>FastAPI</w:t>
+            </w:r>
+            <w:proofErr w:type="spellEnd"/>
+            <w:r>
+              <w:rPr>
+                <w:rFonts w:ascii="Verdana" w:hAnsi="Verdana" w:cs="Verdana"/>
+                <w:sz w:val="20"/>
+                <w:lang w:val="en-GB" w:eastAsia="ar-SA"/>
+              </w:rPr>
+              <w:t xml:space="preserve"> services using </w:t>
+            </w:r>
+            <w:proofErr w:type="spellStart"/>
+            <w:r>
+              <w:rPr>
+                <w:rFonts w:ascii="Verdana" w:hAnsi="Verdana" w:cs="Verdana"/>
+                <w:sz w:val="20"/>
+                <w:lang w:val="en-GB" w:eastAsia="ar-SA"/>
+              </w:rPr>
+              <w:t>Pydantic</w:t>
+            </w:r>
+            <w:proofErr w:type="spellEnd"/>
+            <w:r>
+              <w:rPr>
+                <w:rFonts w:ascii="Verdana" w:hAnsi="Verdana" w:cs="Verdana"/>
+                <w:sz w:val="20"/>
+                <w:lang w:val="en-GB" w:eastAsia="ar-SA"/>
+              </w:rPr>
+              <w:t xml:space="preserve"> validation and </w:t>
+            </w:r>
+            <w:proofErr w:type="spellStart"/>
+            <w:r>
+              <w:rPr>
+                <w:rFonts w:ascii="Verdana" w:hAnsi="Verdana" w:cs="Verdana"/>
+                <w:sz w:val="20"/>
+                <w:lang w:val="en-GB" w:eastAsia="ar-SA"/>
+              </w:rPr>
+              <w:t>SQLAlchemy</w:t>
+            </w:r>
+            <w:proofErr w:type="spellEnd"/>
+            <w:r>
+              <w:rPr>
+                <w:rFonts w:ascii="Verdana" w:hAnsi="Verdana" w:cs="Verdana"/>
+                <w:sz w:val="20"/>
+                <w:lang w:val="en-GB" w:eastAsia="ar-SA"/>
+              </w:rPr>
+              <w:t xml:space="preserve">, with </w:t>
+            </w:r>
+            <w:proofErr w:type="spellStart"/>
+            <w:r>
+              <w:rPr>
+                <w:rFonts w:ascii="Verdana" w:hAnsi="Verdana" w:cs="Verdana"/>
+                <w:sz w:val="20"/>
+                <w:lang w:val="en-GB" w:eastAsia="ar-SA"/>
+              </w:rPr>
+              <w:t>Pytest</w:t>
+            </w:r>
+            <w:proofErr w:type="spellEnd"/>
+            <w:r>
+              <w:rPr>
+                <w:rFonts w:ascii="Verdana" w:hAnsi="Verdana" w:cs="Verdana"/>
+                <w:sz w:val="20"/>
+                <w:lang w:val="en-GB" w:eastAsia="ar-SA"/>
+              </w:rPr>
+              <w:t xml:space="preserve"> automated testing. Worked directly with investment stakeholders to translate complex business rules into maintainable software, validate calculation outputs and improve the reliability, consistency and scalability of fund analytics.</w:t>
             </w:r>
           </w:p>
           <w:p>
@@ -4241,7 +4404,7 @@
                 <w:lang w:val="en-GB"/>
               </w:rPr>
             </w:pPr>
-            <w:hyperlink r:id="rId19" w:history="1">
+            <w:hyperlink r:id="rId18" w:history="1">
               <w:r>
                 <w:rPr>
                   <w:rStyle w:val="Hyperlink"/>
@@ -4434,7 +4597,25 @@
                 <w:sz w:val="20"/>
                 <w:lang w:val="en-GB" w:eastAsia="ar-SA"/>
               </w:rPr>
-              <w:t>Designed and developed Python/FastAPI microservices and REST APIs integrating external data providers, deploying services through Docker/Kubernetes and AWS Lambda/API Gateway</w:t>
+              <w:t>Designed and developed Python/</w:t>
+            </w:r>
+            <w:proofErr w:type="spellStart"/>
+            <w:r>
+              <w:rPr>
+                <w:rFonts w:ascii="Verdana" w:hAnsi="Verdana" w:cs="Verdana"/>
+                <w:sz w:val="20"/>
+                <w:lang w:val="en-GB" w:eastAsia="ar-SA"/>
+              </w:rPr>
+              <w:t>FastAPI</w:t>
+            </w:r>
+            <w:proofErr w:type="spellEnd"/>
+            <w:r>
+              <w:rPr>
+                <w:rFonts w:ascii="Verdana" w:hAnsi="Verdana" w:cs="Verdana"/>
+                <w:sz w:val="20"/>
+                <w:lang w:val="en-GB" w:eastAsia="ar-SA"/>
+              </w:rPr>
+              <w:t xml:space="preserve"> microservices and REST APIs integrating external data providers, deploying services through Docker/Kubernetes and AWS Lambda/API Gateway</w:t>
             </w:r>
             <w:r>
               <w:rPr>
@@ -5281,7 +5462,7 @@
                 <w:lang w:val="en-GB"/>
               </w:rPr>
             </w:pPr>
-            <w:hyperlink r:id="rId20" w:history="1">
+            <w:hyperlink r:id="rId19" w:history="1">
               <w:r>
                 <w:rPr>
                   <w:rStyle w:val="Hyperlink"/>
@@ -6330,7 +6511,7 @@
                 <w:lang w:val="en-GB"/>
               </w:rPr>
             </w:pPr>
-            <w:hyperlink r:id="rId21" w:history="1">
+            <w:hyperlink r:id="rId20" w:history="1">
               <w:r>
                 <w:rPr>
                   <w:rStyle w:val="Hyperlink"/>
@@ -6351,7 +6532,7 @@
               </w:rPr>
               <w:t xml:space="preserve"> for ESA - </w:t>
             </w:r>
-            <w:hyperlink r:id="rId22" w:history="1">
+            <w:hyperlink r:id="rId21" w:history="1">
               <w:r>
                 <w:rPr>
                   <w:rStyle w:val="Hyperlink"/>
@@ -6613,7 +6794,25 @@
                 <w:sz w:val="20"/>
                 <w:lang w:val="en-GB" w:eastAsia="ar-SA"/>
               </w:rPr>
-              <w:t>Designed and developed Java/Spring Boot REST services and React/JSF applications supporting 350+ European Space Agency R&amp;D activities, working within a secure private-cloud enterprise environment.</w:t>
+              <w:t xml:space="preserve">Designed and developed Java/Spring Boot REST services and </w:t>
+            </w:r>
+            <w:proofErr w:type="gramStart"/>
+            <w:r>
+              <w:rPr>
+                <w:rFonts w:ascii="Verdana" w:hAnsi="Verdana" w:cs="Verdana"/>
+                <w:sz w:val="20"/>
+                <w:lang w:val="en-GB" w:eastAsia="ar-SA"/>
+              </w:rPr>
+              <w:t>React</w:t>
+            </w:r>
+            <w:proofErr w:type="gramEnd"/>
+            <w:r>
+              <w:rPr>
+                <w:rFonts w:ascii="Verdana" w:hAnsi="Verdana" w:cs="Verdana"/>
+                <w:sz w:val="20"/>
+                <w:lang w:val="en-GB" w:eastAsia="ar-SA"/>
+              </w:rPr>
+              <w:t>/JSF applications supporting 350+ European Space Agency R&amp;D activities, working within a secure private-cloud enterprise environment.</w:t>
             </w:r>
           </w:p>
           <w:p>
@@ -7201,7 +7400,7 @@
                 <w:lang w:val="en-GB"/>
               </w:rPr>
             </w:pPr>
-            <w:hyperlink r:id="rId23" w:history="1">
+            <w:hyperlink r:id="rId22" w:history="1">
               <w:r>
                 <w:rPr>
                   <w:rStyle w:val="Hyperlink"/>
@@ -8082,7 +8281,7 @@
                 <w:lang w:val="en-GB"/>
               </w:rPr>
             </w:pPr>
-            <w:hyperlink r:id="rId24" w:history="1">
+            <w:hyperlink r:id="rId23" w:history="1">
               <w:r>
                 <w:rPr>
                   <w:rStyle w:val="Hyperlink"/>
@@ -9029,7 +9228,7 @@
                 <w:lang w:val="en-GB"/>
               </w:rPr>
             </w:pPr>
-            <w:hyperlink r:id="rId25" w:history="1">
+            <w:hyperlink r:id="rId24" w:history="1">
               <w:r>
                 <w:rPr>
                   <w:rStyle w:val="Hyperlink"/>
@@ -9743,7 +9942,7 @@
                 <w:lang w:val="en-GB"/>
               </w:rPr>
             </w:pPr>
-            <w:hyperlink r:id="rId26" w:history="1">
+            <w:hyperlink r:id="rId25" w:history="1">
               <w:r>
                 <w:rPr>
                   <w:rStyle w:val="Hyperlink"/>
@@ -10697,7 +10896,7 @@
                 <w:lang w:val="en-GB"/>
               </w:rPr>
             </w:pPr>
-            <w:hyperlink r:id="rId27" w:history="1">
+            <w:hyperlink r:id="rId26" w:history="1">
               <w:r>
                 <w:rPr>
                   <w:rStyle w:val="Hyperlink"/>
@@ -11582,7 +11781,7 @@
                 <w:sz w:val="20"/>
                 <w:lang w:val="en-GB"/>
               </w:rPr>
-              <w:pict w14:anchorId="4A1117E1">
+              <w:pict w14:anchorId="4BF510CB">
                 <v:group id="_x0000_s2260" style="position:absolute;margin-left:56.2pt;margin-top:-446.8pt;width:142.2pt;height:16.5pt;z-index:-3;mso-position-horizontal-relative:text;mso-position-vertical-relative:text" coordorigin="1342,3892" coordsize="2700,180" o:allowincell="f">
                   <v:rect id="_x0000_s2261" style="position:absolute;left:1342;top:3892;width:2700;height:180" fillcolor="#31849b" stroked="f">
                     <v:fill opacity="59638f"/>
@@ -11645,7 +11844,7 @@
               </w:rPr>
               <w:t xml:space="preserve">Client Knowledge Limited (now </w:t>
             </w:r>
-            <w:hyperlink r:id="rId28" w:history="1">
+            <w:hyperlink r:id="rId27" w:history="1">
               <w:r>
                 <w:rPr>
                   <w:rStyle w:val="Hyperlink"/>
@@ -12471,7 +12670,7 @@
               </w:rPr>
               <w:t xml:space="preserve">Barclays Global Investors (now </w:t>
             </w:r>
-            <w:hyperlink r:id="rId29" w:history="1">
+            <w:hyperlink r:id="rId28" w:history="1">
               <w:r>
                 <w:rPr>
                   <w:rStyle w:val="Hyperlink"/>
@@ -12766,7 +12965,7 @@
                 <w:lang w:val="en-GB" w:eastAsia="ar-SA"/>
               </w:rPr>
             </w:pPr>
-            <w:hyperlink r:id="rId30" w:history="1">
+            <w:hyperlink r:id="rId29" w:history="1">
               <w:r>
                 <w:rPr>
                   <w:rStyle w:val="Hyperlink"/>
@@ -13162,7 +13361,7 @@
                 <w:lang w:val="en-GB" w:eastAsia="ar-SA"/>
               </w:rPr>
             </w:pPr>
-            <w:hyperlink r:id="rId31" w:history="1">
+            <w:hyperlink r:id="rId30" w:history="1">
               <w:r>
                 <w:rPr>
                   <w:rStyle w:val="Hyperlink"/>
@@ -13459,12 +13658,12 @@
       </w:pPr>
     </w:p>
     <w:sectPr>
-      <w:headerReference w:type="even" r:id="rId32"/>
-      <w:headerReference w:type="default" r:id="rId33"/>
-      <w:footerReference w:type="even" r:id="rId34"/>
-      <w:footerReference w:type="default" r:id="rId35"/>
-      <w:headerReference w:type="first" r:id="rId36"/>
-      <w:footerReference w:type="first" r:id="rId37"/>
+      <w:headerReference w:type="even" r:id="rId31"/>
+      <w:headerReference w:type="default" r:id="rId32"/>
+      <w:footerReference w:type="even" r:id="rId33"/>
+      <w:footerReference w:type="default" r:id="rId34"/>
+      <w:headerReference w:type="first" r:id="rId35"/>
+      <w:footerReference w:type="first" r:id="rId36"/>
       <w:pgSz w:w="11906" w:h="16838"/>
       <w:pgMar w:top="284" w:right="284" w:bottom="284" w:left="284" w:header="567" w:footer="454" w:gutter="0"/>
       <w:cols w:space="708"/>
@@ -13527,7 +13726,7 @@
         <w:szCs w:val="22"/>
         <w:lang w:val="en-GB" w:eastAsia="ar-SA"/>
       </w:rPr>
-      <w:pict w14:anchorId="34B82411">
+      <w:pict w14:anchorId="21EF2691">
         <v:group id="Group 2" o:spid="_x0000_s1028" style="position:absolute;margin-left:526.8pt;margin-top:-.15pt;width:39.7pt;height:17pt;z-index:-1" coordorigin="614,660" coordsize="864,374" wrapcoords="0 -939 -408 1878 -408 19722 0 21600 21192 21600 21600 21600 22008 16904 22008 939 21192 -939 0 -939">
           <v:roundrect id="_x0000_s1029" style="position:absolute;left:859;top:415;width:374;height:864;rotation:-90;visibility:visible" arcsize="10923f" filled="f" strokecolor="#247a00" strokeweight="1pt">
             <v:shadow color="#868686"/>
@@ -17448,52 +17647,52 @@
       </w:rPr>
     </w:lvl>
   </w:abstractNum>
-  <w:num w:numId="1" w16cid:durableId="1598832499">
+  <w:num w:numId="1" w16cid:durableId="867762399">
     <w:abstractNumId w:val="8"/>
   </w:num>
-  <w:num w:numId="2" w16cid:durableId="1561135849">
+  <w:num w:numId="2" w16cid:durableId="512181956">
     <w:abstractNumId w:val="26"/>
   </w:num>
-  <w:num w:numId="3" w16cid:durableId="805858823">
+  <w:num w:numId="3" w16cid:durableId="67575799">
     <w:abstractNumId w:val="17"/>
   </w:num>
-  <w:num w:numId="4" w16cid:durableId="1253318916">
+  <w:num w:numId="4" w16cid:durableId="234437616">
     <w:abstractNumId w:val="23"/>
   </w:num>
-  <w:num w:numId="5" w16cid:durableId="1251235189">
+  <w:num w:numId="5" w16cid:durableId="583030282">
     <w:abstractNumId w:val="7"/>
   </w:num>
-  <w:num w:numId="6" w16cid:durableId="980814545">
+  <w:num w:numId="6" w16cid:durableId="192116221">
     <w:abstractNumId w:val="24"/>
   </w:num>
-  <w:num w:numId="7" w16cid:durableId="503857856">
+  <w:num w:numId="7" w16cid:durableId="827675057">
     <w:abstractNumId w:val="27"/>
   </w:num>
-  <w:num w:numId="8" w16cid:durableId="235864637">
+  <w:num w:numId="8" w16cid:durableId="1285382115">
     <w:abstractNumId w:val="19"/>
   </w:num>
-  <w:num w:numId="9" w16cid:durableId="162356063">
+  <w:num w:numId="9" w16cid:durableId="1433476187">
     <w:abstractNumId w:val="21"/>
   </w:num>
-  <w:num w:numId="10" w16cid:durableId="66463022">
+  <w:num w:numId="10" w16cid:durableId="418412425">
     <w:abstractNumId w:val="0"/>
   </w:num>
-  <w:num w:numId="11" w16cid:durableId="184247626">
+  <w:num w:numId="11" w16cid:durableId="532153425">
     <w:abstractNumId w:val="25"/>
   </w:num>
-  <w:num w:numId="12" w16cid:durableId="628752775">
+  <w:num w:numId="12" w16cid:durableId="1055087471">
     <w:abstractNumId w:val="14"/>
   </w:num>
-  <w:num w:numId="13" w16cid:durableId="1179585181">
+  <w:num w:numId="13" w16cid:durableId="2133934711">
     <w:abstractNumId w:val="22"/>
   </w:num>
-  <w:num w:numId="14" w16cid:durableId="1472671903">
+  <w:num w:numId="14" w16cid:durableId="605773340">
     <w:abstractNumId w:val="3"/>
   </w:num>
-  <w:num w:numId="15" w16cid:durableId="2030372693">
+  <w:num w:numId="15" w16cid:durableId="505249054">
     <w:abstractNumId w:val="9"/>
   </w:num>
-  <w:num w:numId="16" w16cid:durableId="20592194">
+  <w:num w:numId="16" w16cid:durableId="909002048">
     <w:abstractNumId w:val="10"/>
     <w:lvlOverride w:ilvl="0"/>
     <w:lvlOverride w:ilvl="1"/>
@@ -17505,7 +17704,7 @@
     <w:lvlOverride w:ilvl="7"/>
     <w:lvlOverride w:ilvl="8"/>
   </w:num>
-  <w:num w:numId="17" w16cid:durableId="1260597595">
+  <w:num w:numId="17" w16cid:durableId="1713379706">
     <w:abstractNumId w:val="16"/>
     <w:lvlOverride w:ilvl="0"/>
     <w:lvlOverride w:ilvl="1"/>
@@ -17517,37 +17716,37 @@
     <w:lvlOverride w:ilvl="7"/>
     <w:lvlOverride w:ilvl="8"/>
   </w:num>
-  <w:num w:numId="18" w16cid:durableId="606350078">
+  <w:num w:numId="18" w16cid:durableId="86923224">
     <w:abstractNumId w:val="4"/>
   </w:num>
-  <w:num w:numId="19" w16cid:durableId="511115890">
+  <w:num w:numId="19" w16cid:durableId="1071808489">
     <w:abstractNumId w:val="15"/>
   </w:num>
-  <w:num w:numId="20" w16cid:durableId="1933977333">
+  <w:num w:numId="20" w16cid:durableId="1876497772">
     <w:abstractNumId w:val="6"/>
   </w:num>
-  <w:num w:numId="21" w16cid:durableId="957758278">
+  <w:num w:numId="21" w16cid:durableId="250434115">
     <w:abstractNumId w:val="2"/>
   </w:num>
-  <w:num w:numId="22" w16cid:durableId="627315777">
+  <w:num w:numId="22" w16cid:durableId="250162682">
     <w:abstractNumId w:val="13"/>
   </w:num>
-  <w:num w:numId="23" w16cid:durableId="887911575">
+  <w:num w:numId="23" w16cid:durableId="278873049">
     <w:abstractNumId w:val="5"/>
   </w:num>
-  <w:num w:numId="24" w16cid:durableId="337317452">
+  <w:num w:numId="24" w16cid:durableId="727074389">
     <w:abstractNumId w:val="12"/>
   </w:num>
-  <w:num w:numId="25" w16cid:durableId="696275667">
+  <w:num w:numId="25" w16cid:durableId="1721052075">
     <w:abstractNumId w:val="11"/>
   </w:num>
-  <w:num w:numId="26" w16cid:durableId="654722652">
+  <w:num w:numId="26" w16cid:durableId="1787263956">
     <w:abstractNumId w:val="18"/>
   </w:num>
-  <w:num w:numId="27" w16cid:durableId="1938781213">
+  <w:num w:numId="27" w16cid:durableId="1226187908">
     <w:abstractNumId w:val="20"/>
   </w:num>
-  <w:num w:numId="28" w16cid:durableId="1317685247">
+  <w:num w:numId="28" w16cid:durableId="405035761">
     <w:abstractNumId w:val="1"/>
   </w:num>
 </w:numbering>

</xml_diff>